<commit_message>
feat: new invoices. Fixed bugs on login screen
</commit_message>
<xml_diff>
--- a/BookLocal.API/wwwroot/templates/30/Contract.docx
+++ b/BookLocal.API/wwwroot/templates/30/Contract.docx
@@ -38,126 +38,6 @@
         </w:rPr>
         <w:t>}}</w:t>
       </w:r>
-      <w:r>
-        <w:rPr>
-          <w:b/>
-          <w:bCs/>
-          <w:sz w:val="22"/>
-          <w:szCs w:val="22"/>
-        </w:rPr>
-        <w:t xml:space="preserve"> </w:t>
-      </w:r>
-      <w:r>
-        <w:rPr>
-          <w:b/>
-          <w:bCs/>
-          <w:sz w:val="22"/>
-          <w:szCs w:val="22"/>
-        </w:rPr>
-        <w:t>{{</w:t>
-      </w:r>
-      <w:proofErr w:type="spellStart"/>
-      <w:r>
-        <w:rPr>
-          <w:b/>
-          <w:bCs/>
-          <w:sz w:val="22"/>
-          <w:szCs w:val="22"/>
-        </w:rPr>
-        <w:t>TypUmowy</w:t>
-      </w:r>
-      <w:proofErr w:type="spellEnd"/>
-      <w:r>
-        <w:rPr>
-          <w:b/>
-          <w:bCs/>
-          <w:sz w:val="22"/>
-          <w:szCs w:val="22"/>
-        </w:rPr>
-        <w:t>}}</w:t>
-      </w:r>
-    </w:p>
-    <w:p>
-      <w:pPr>
-        <w:rPr>
-          <w:sz w:val="22"/>
-          <w:szCs w:val="22"/>
-        </w:rPr>
-      </w:pPr>
-      <w:r>
-        <w:rPr>
-          <w:b/>
-          <w:bCs/>
-          <w:sz w:val="22"/>
-          <w:szCs w:val="22"/>
-        </w:rPr>
-        <w:t>{{</w:t>
-      </w:r>
-      <w:proofErr w:type="spellStart"/>
-      <w:r>
-        <w:rPr>
-          <w:b/>
-          <w:bCs/>
-          <w:sz w:val="22"/>
-          <w:szCs w:val="22"/>
-        </w:rPr>
-        <w:t>TypUmowy</w:t>
-      </w:r>
-      <w:proofErr w:type="spellEnd"/>
-      <w:r>
-        <w:rPr>
-          <w:b/>
-          <w:bCs/>
-          <w:sz w:val="22"/>
-          <w:szCs w:val="22"/>
-        </w:rPr>
-        <w:t>}}</w:t>
-      </w:r>
-    </w:p>
-    <w:p>
-      <w:pPr>
-        <w:rPr>
-          <w:sz w:val="22"/>
-          <w:szCs w:val="22"/>
-        </w:rPr>
-      </w:pPr>
-      <w:r>
-        <w:rPr>
-          <w:b/>
-          <w:bCs/>
-          <w:sz w:val="22"/>
-          <w:szCs w:val="22"/>
-        </w:rPr>
-        <w:t>{{</w:t>
-      </w:r>
-      <w:proofErr w:type="spellStart"/>
-      <w:r>
-        <w:rPr>
-          <w:b/>
-          <w:bCs/>
-          <w:sz w:val="22"/>
-          <w:szCs w:val="22"/>
-        </w:rPr>
-        <w:t>TypUmowy</w:t>
-      </w:r>
-      <w:proofErr w:type="spellEnd"/>
-      <w:r>
-        <w:rPr>
-          <w:b/>
-          <w:bCs/>
-          <w:sz w:val="22"/>
-          <w:szCs w:val="22"/>
-        </w:rPr>
-        <w:t>}}</w:t>
-      </w:r>
-    </w:p>
-    <w:p>
-      <w:pPr>
-        <w:rPr>
-          <w:sz w:val="22"/>
-          <w:szCs w:val="22"/>
-        </w:rPr>
-      </w:pPr>
     </w:p>
     <w:p>
       <w:pPr>
@@ -922,7 +802,6 @@
           <w:sz w:val="22"/>
           <w:szCs w:val="22"/>
         </w:rPr>
-        <w:lastRenderedPageBreak/>
         <w:br/>
       </w:r>
     </w:p>

</xml_diff>